<commit_message>
fix: service result for skibiki frontend dev
</commit_message>
<xml_diff>
--- a/src/templates/service_request_template.docx
+++ b/src/templates/service_request_template.docx
@@ -181,7 +181,13 @@
         <w:rPr>
           <w:rFonts w:ascii="Times New Roman" w:eastAsia="Times New Roman" w:hAnsi="Times New Roman" w:cs="Times New Roman"/>
         </w:rPr>
-        <w:t xml:space="preserve"> Mã phiếu chỉ định: CLS-10012026-131218</w:t>
+        <w:t xml:space="preserve"> Mã phiếu chỉ định: </w:t>
+      </w:r>
+      <w:r>
+        <w:rPr>
+          <w:rFonts w:ascii="Times New Roman" w:eastAsia="Times New Roman" w:hAnsi="Times New Roman" w:cs="Times New Roman"/>
+        </w:rPr>
+        <w:t>{{requestId}}</w:t>
       </w:r>
     </w:p>
     <w:p>
@@ -191,54 +197,22 @@
         <w:jc w:val="center"/>
         <w:rPr>
           <w:rFonts w:ascii="Times New Roman" w:eastAsia="Times New Roman" w:hAnsi="Times New Roman" w:cs="Times New Roman"/>
+          <w:lang w:val="en-US"/>
         </w:rPr>
       </w:pPr>
       <w:r>
         <w:rPr>
           <w:rFonts w:ascii="Times New Roman" w:eastAsia="Times New Roman" w:hAnsi="Times New Roman" w:cs="Times New Roman"/>
           <w:noProof/>
-        </w:rPr>
-        <w:drawing>
-          <wp:inline distT="114300" distB="114300" distL="114300" distR="114300" wp14:anchorId="7D41BDA8" wp14:editId="5E15CA52">
-            <wp:extent cx="2295525" cy="370804"/>
-            <wp:effectExtent l="0" t="0" r="0" b="0"/>
-            <wp:docPr id="1" name="image1.png"/>
-            <wp:cNvGraphicFramePr/>
-            <a:graphic xmlns:a="http://schemas.openxmlformats.org/drawingml/2006/main">
-              <a:graphicData uri="http://schemas.openxmlformats.org/drawingml/2006/picture">
-                <pic:pic xmlns:pic="http://schemas.openxmlformats.org/drawingml/2006/picture">
-                  <pic:nvPicPr>
-                    <pic:cNvPr id="0" name="image1.png"/>
-                    <pic:cNvPicPr preferRelativeResize="0"/>
-                  </pic:nvPicPr>
-                  <pic:blipFill>
-                    <a:blip r:embed="rId4"/>
-                    <a:srcRect/>
-                    <a:stretch>
-                      <a:fillRect/>
-                    </a:stretch>
-                  </pic:blipFill>
-                  <pic:spPr>
-                    <a:xfrm>
-                      <a:off x="0" y="0"/>
-                      <a:ext cx="2295525" cy="370804"/>
-                    </a:xfrm>
-                    <a:prstGeom prst="rect">
-                      <a:avLst/>
-                    </a:prstGeom>
-                    <a:ln/>
-                  </pic:spPr>
-                </pic:pic>
-              </a:graphicData>
-            </a:graphic>
-          </wp:inline>
-        </w:drawing>
+          <w:lang w:val="en-US"/>
+        </w:rPr>
+        <w:t>{{%%barcode}}</w:t>
       </w:r>
     </w:p>
     <w:p>
       <w:pPr>
-        <w:spacing w:line="312" w:lineRule="auto"/>
-        <w:ind w:left="-425" w:right="-436"/>
+        <w:spacing w:line="240" w:lineRule="auto"/>
+        <w:ind w:left="-425" w:right="-437"/>
         <w:jc w:val="center"/>
         <w:rPr>
           <w:rFonts w:ascii="Times New Roman" w:eastAsia="Times New Roman" w:hAnsi="Times New Roman" w:cs="Times New Roman"/>
@@ -256,13 +230,14 @@
         </w:pBdr>
         <w:tabs>
           <w:tab w:val="left" w:pos="900"/>
-          <w:tab w:val="left" w:pos="5670"/>
+          <w:tab w:val="left" w:pos="4111"/>
           <w:tab w:val="right" w:pos="9000"/>
         </w:tabs>
         <w:spacing w:line="240" w:lineRule="auto"/>
-        <w:ind w:left="-425" w:right="-436"/>
-        <w:rPr>
-          <w:rFonts w:ascii="Times New Roman" w:eastAsia="Times New Roman" w:hAnsi="Times New Roman" w:cs="Times New Roman"/>
+        <w:ind w:left="-425" w:right="-437"/>
+        <w:rPr>
+          <w:rFonts w:ascii="Times New Roman" w:eastAsia="Times New Roman" w:hAnsi="Times New Roman" w:cs="Times New Roman"/>
+          <w:lang w:val="en-US"/>
         </w:rPr>
       </w:pPr>
       <w:r>
@@ -282,7 +257,6 @@
       <w:r>
         <w:rPr>
           <w:rFonts w:ascii="Times New Roman" w:eastAsia="Times New Roman" w:hAnsi="Times New Roman" w:cs="Times New Roman"/>
-          <w:lang w:val="en-US"/>
         </w:rPr>
         <w:tab/>
       </w:r>
@@ -290,15 +264,8 @@
         <w:rPr>
           <w:rFonts w:ascii="Times New Roman" w:eastAsia="Times New Roman" w:hAnsi="Times New Roman" w:cs="Times New Roman"/>
           <w:color w:val="081B3A"/>
-          <w:highlight w:val="white"/>
-        </w:rPr>
-        <w:t>NGUYỄN</w:t>
-      </w:r>
-      <w:r>
-        <w:rPr>
-          <w:rFonts w:ascii="Times New Roman" w:eastAsia="Times New Roman" w:hAnsi="Times New Roman" w:cs="Times New Roman"/>
-        </w:rPr>
-        <w:t xml:space="preserve"> THÀNH DANH</w:t>
+        </w:rPr>
+        <w:t>{{patientName}}</w:t>
       </w:r>
       <w:r>
         <w:rPr>
@@ -336,7 +303,13 @@
         <w:rPr>
           <w:rFonts w:ascii="Times New Roman" w:eastAsia="Times New Roman" w:hAnsi="Times New Roman" w:cs="Times New Roman"/>
         </w:rPr>
-        <w:t xml:space="preserve"> 1997</w:t>
+        <w:t xml:space="preserve"> </w:t>
+      </w:r>
+      <w:r>
+        <w:rPr>
+          <w:rFonts w:ascii="Times New Roman" w:eastAsia="Times New Roman" w:hAnsi="Times New Roman" w:cs="Times New Roman"/>
+        </w:rPr>
+        <w:t>{{dob}}</w:t>
       </w:r>
       <w:r>
         <w:rPr>
@@ -356,7 +329,13 @@
         <w:rPr>
           <w:rFonts w:ascii="Times New Roman" w:eastAsia="Times New Roman" w:hAnsi="Times New Roman" w:cs="Times New Roman"/>
         </w:rPr>
-        <w:t xml:space="preserve"> Nam</w:t>
+        <w:t xml:space="preserve"> </w:t>
+      </w:r>
+      <w:r>
+        <w:rPr>
+          <w:rFonts w:ascii="Times New Roman" w:eastAsia="Times New Roman" w:hAnsi="Times New Roman" w:cs="Times New Roman"/>
+        </w:rPr>
+        <w:t>{{gender}}</w:t>
       </w:r>
     </w:p>
     <w:p>
@@ -376,7 +355,7 @@
           <w:tab w:val="right" w:pos="9000"/>
         </w:tabs>
         <w:spacing w:line="240" w:lineRule="auto"/>
-        <w:ind w:left="-425" w:right="-436"/>
+        <w:ind w:left="-425" w:right="-437"/>
         <w:rPr>
           <w:rFonts w:ascii="Times New Roman" w:eastAsia="Times New Roman" w:hAnsi="Times New Roman" w:cs="Times New Roman"/>
           <w:lang w:val="en-US"/>
@@ -406,50 +385,9 @@
         <w:rPr>
           <w:rFonts w:ascii="Times New Roman" w:eastAsia="Times New Roman" w:hAnsi="Times New Roman" w:cs="Times New Roman"/>
           <w:color w:val="081B3A"/>
-          <w:highlight w:val="white"/>
-        </w:rPr>
-        <w:t>351/</w:t>
-      </w:r>
-      <w:r>
-        <w:rPr>
-          <w:rFonts w:ascii="Times New Roman" w:eastAsia="Times New Roman" w:hAnsi="Times New Roman" w:cs="Times New Roman"/>
-        </w:rPr>
-        <w:t xml:space="preserve">86 </w:t>
-      </w:r>
-      <w:r>
-        <w:rPr>
-          <w:rFonts w:ascii="Times New Roman" w:eastAsia="Times New Roman" w:hAnsi="Times New Roman" w:cs="Times New Roman"/>
-          <w:color w:val="081B3A"/>
-          <w:highlight w:val="white"/>
-        </w:rPr>
-        <w:t>Võ</w:t>
-      </w:r>
-      <w:r>
-        <w:rPr>
-          <w:rFonts w:ascii="Times New Roman" w:eastAsia="Times New Roman" w:hAnsi="Times New Roman" w:cs="Times New Roman"/>
-        </w:rPr>
-        <w:t xml:space="preserve"> Văn Hát, Thủ Đức, Thành phố Hồ Chí Minh</w:t>
-      </w:r>
-      <w:r>
-        <w:rPr>
-          <w:rFonts w:ascii="Times New Roman" w:eastAsia="Times New Roman" w:hAnsi="Times New Roman" w:cs="Times New Roman"/>
           <w:lang w:val="en-US"/>
         </w:rPr>
-        <w:t xml:space="preserve">, </w:t>
-      </w:r>
-      <w:r>
-        <w:rPr>
-          <w:rFonts w:ascii="Times New Roman" w:eastAsia="Times New Roman" w:hAnsi="Times New Roman" w:cs="Times New Roman"/>
-          <w:color w:val="081B3A"/>
-          <w:highlight w:val="white"/>
-        </w:rPr>
-        <w:t>Võ</w:t>
-      </w:r>
-      <w:r>
-        <w:rPr>
-          <w:rFonts w:ascii="Times New Roman" w:eastAsia="Times New Roman" w:hAnsi="Times New Roman" w:cs="Times New Roman"/>
-        </w:rPr>
-        <w:t xml:space="preserve"> Văn Hát, Thủ Đức, Thành phố Hồ Chí Minh</w:t>
+        <w:t>{{address}}</w:t>
       </w:r>
     </w:p>
     <w:p>
@@ -469,9 +407,10 @@
           <w:tab w:val="right" w:pos="9000"/>
         </w:tabs>
         <w:spacing w:line="240" w:lineRule="auto"/>
-        <w:ind w:left="-425" w:right="-436"/>
-        <w:rPr>
-          <w:rFonts w:ascii="Times New Roman" w:eastAsia="Times New Roman" w:hAnsi="Times New Roman" w:cs="Times New Roman"/>
+        <w:ind w:left="-425" w:right="-437"/>
+        <w:rPr>
+          <w:rFonts w:ascii="Times New Roman" w:eastAsia="Times New Roman" w:hAnsi="Times New Roman" w:cs="Times New Roman"/>
+          <w:lang w:val="en-US"/>
         </w:rPr>
       </w:pPr>
       <w:r>
@@ -491,15 +430,15 @@
       <w:r>
         <w:rPr>
           <w:rFonts w:ascii="Times New Roman" w:eastAsia="Times New Roman" w:hAnsi="Times New Roman" w:cs="Times New Roman"/>
+        </w:rPr>
+        <w:tab/>
+      </w:r>
+      <w:r>
+        <w:rPr>
+          <w:rFonts w:ascii="Times New Roman" w:eastAsia="Times New Roman" w:hAnsi="Times New Roman" w:cs="Times New Roman"/>
           <w:lang w:val="en-US"/>
         </w:rPr>
-        <w:tab/>
-      </w:r>
-      <w:r>
-        <w:rPr>
-          <w:rFonts w:ascii="Times New Roman" w:eastAsia="Times New Roman" w:hAnsi="Times New Roman" w:cs="Times New Roman"/>
-        </w:rPr>
-        <w:t>0155155625</w:t>
+        <w:t>{{phone}}</w:t>
       </w:r>
     </w:p>
     <w:p>
@@ -519,7 +458,7 @@
           <w:tab w:val="right" w:pos="9000"/>
         </w:tabs>
         <w:spacing w:line="240" w:lineRule="auto"/>
-        <w:ind w:left="-425" w:right="-436"/>
+        <w:ind w:left="-425" w:right="-437"/>
         <w:rPr>
           <w:rFonts w:ascii="Times New Roman" w:eastAsia="Times New Roman" w:hAnsi="Times New Roman" w:cs="Times New Roman"/>
         </w:rPr>
@@ -576,7 +515,7 @@
           <w:tab w:val="right" w:pos="9000"/>
         </w:tabs>
         <w:spacing w:line="240" w:lineRule="auto"/>
-        <w:ind w:left="-425" w:right="-436"/>
+        <w:ind w:left="-425" w:right="-437"/>
         <w:rPr>
           <w:rFonts w:ascii="Times New Roman" w:eastAsia="Times New Roman" w:hAnsi="Times New Roman" w:cs="Times New Roman"/>
           <w:color w:val="081B3A"/>
@@ -3071,7 +3010,6 @@
           <w:rFonts w:ascii="Times New Roman" w:eastAsia="Times New Roman" w:hAnsi="Times New Roman" w:cs="Times New Roman"/>
           <w:color w:val="081B3A"/>
           <w:highlight w:val="white"/>
-          <w:lang w:val="en-US"/>
         </w:rPr>
       </w:pPr>
     </w:p>
@@ -3092,7 +3030,6 @@
           <w:rFonts w:ascii="Times New Roman" w:eastAsia="Times New Roman" w:hAnsi="Times New Roman" w:cs="Times New Roman"/>
           <w:color w:val="081B3A"/>
           <w:highlight w:val="white"/>
-          <w:lang w:val="en-US"/>
         </w:rPr>
       </w:pPr>
     </w:p>
@@ -3113,7 +3050,6 @@
           <w:rFonts w:ascii="Times New Roman" w:eastAsia="Times New Roman" w:hAnsi="Times New Roman" w:cs="Times New Roman"/>
           <w:color w:val="081B3A"/>
           <w:highlight w:val="white"/>
-          <w:lang w:val="en-US"/>
         </w:rPr>
       </w:pPr>
     </w:p>
@@ -3134,7 +3070,6 @@
           <w:rFonts w:ascii="Times New Roman" w:eastAsia="Times New Roman" w:hAnsi="Times New Roman" w:cs="Times New Roman"/>
           <w:color w:val="081B3A"/>
           <w:highlight w:val="white"/>
-          <w:lang w:val="en-US"/>
         </w:rPr>
       </w:pPr>
     </w:p>

</xml_diff>